<commit_message>
organizar y actualizar las habilidades
se actualizan los skills
</commit_message>
<xml_diff>
--- a/Documentos/Funciones/Arquitectura.docx
+++ b/Documentos/Funciones/Arquitectura.docx
@@ -59,7 +59,23 @@
           <w:b/>
           <w:bCs/>
         </w:rPr>
-        <w:t>Capa Presentation (Web MVC):</w:t>
+        <w:t xml:space="preserve">Capa </w:t>
+      </w:r>
+      <w:proofErr w:type="spellStart"/>
+      <w:r>
+        <w:rPr>
+          <w:b/>
+          <w:bCs/>
+        </w:rPr>
+        <w:t>Presentation</w:t>
+      </w:r>
+      <w:proofErr w:type="spellEnd"/>
+      <w:r>
+        <w:rPr>
+          <w:b/>
+          <w:bCs/>
+        </w:rPr>
+        <w:t xml:space="preserve"> (Web MVC):</w:t>
       </w:r>
     </w:p>
     <w:p>
@@ -94,23 +110,82 @@
           <w:numId w:val="1"/>
         </w:numPr>
       </w:pPr>
+      <w:proofErr w:type="spellStart"/>
       <w:r>
         <w:t>DependencyContainer</w:t>
       </w:r>
+      <w:proofErr w:type="spellEnd"/>
       <w:r>
         <w:t xml:space="preserve">/ </w:t>
       </w:r>
+      <w:proofErr w:type="spellStart"/>
       <w:r>
         <w:t>ApplicationAccessDependency</w:t>
       </w:r>
+      <w:proofErr w:type="spellEnd"/>
       <w:r>
         <w:t xml:space="preserve"> </w:t>
       </w:r>
       <w:r>
         <w:t>(</w:t>
       </w:r>
-      <w:r>
-        <w:t>public static IServiceCollection AddApplication(this IServiceCollection services)</w:t>
+      <w:proofErr w:type="spellStart"/>
+      <w:r>
+        <w:t>public</w:t>
+      </w:r>
+      <w:proofErr w:type="spellEnd"/>
+      <w:r>
+        <w:t xml:space="preserve"> </w:t>
+      </w:r>
+      <w:proofErr w:type="spellStart"/>
+      <w:r>
+        <w:t>static</w:t>
+      </w:r>
+      <w:proofErr w:type="spellEnd"/>
+      <w:r>
+        <w:t xml:space="preserve"> </w:t>
+      </w:r>
+      <w:proofErr w:type="spellStart"/>
+      <w:r>
+        <w:t>IServiceCollection</w:t>
+      </w:r>
+      <w:proofErr w:type="spellEnd"/>
+      <w:r>
+        <w:t xml:space="preserve"> </w:t>
+      </w:r>
+      <w:proofErr w:type="spellStart"/>
+      <w:proofErr w:type="gramStart"/>
+      <w:r>
+        <w:t>AddApplication</w:t>
+      </w:r>
+      <w:proofErr w:type="spellEnd"/>
+      <w:r>
+        <w:t>(</w:t>
+      </w:r>
+      <w:proofErr w:type="spellStart"/>
+      <w:proofErr w:type="gramEnd"/>
+      <w:r>
+        <w:t>this</w:t>
+      </w:r>
+      <w:proofErr w:type="spellEnd"/>
+      <w:r>
+        <w:t xml:space="preserve"> </w:t>
+      </w:r>
+      <w:proofErr w:type="spellStart"/>
+      <w:r>
+        <w:t>IServiceCollection</w:t>
+      </w:r>
+      <w:proofErr w:type="spellEnd"/>
+      <w:r>
+        <w:t xml:space="preserve"> </w:t>
+      </w:r>
+      <w:proofErr w:type="spellStart"/>
+      <w:r>
+        <w:t>services</w:t>
+      </w:r>
+      <w:proofErr w:type="spellEnd"/>
+      <w:r>
+        <w:t>)</w:t>
       </w:r>
     </w:p>
     <w:p>
@@ -119,10 +194,7 @@
         <w:ind w:left="1440"/>
       </w:pPr>
       <w:r>
-        <w:t xml:space="preserve">    {</w:t>
-      </w:r>
-      <w:r>
-        <w:t>}</w:t>
+        <w:t xml:space="preserve">    {}</w:t>
       </w:r>
     </w:p>
     <w:p>
@@ -142,9 +214,11 @@
           <w:numId w:val="1"/>
         </w:numPr>
       </w:pPr>
+      <w:proofErr w:type="spellStart"/>
       <w:r>
         <w:t>AutoMapper</w:t>
       </w:r>
+      <w:proofErr w:type="spellEnd"/>
     </w:p>
     <w:p>
       <w:pPr>
@@ -154,12 +228,30 @@
           <w:numId w:val="1"/>
         </w:numPr>
       </w:pPr>
+      <w:proofErr w:type="gramStart"/>
       <w:r>
         <w:rPr>
           <w:b/>
           <w:bCs/>
         </w:rPr>
-        <w:t>Capa  Constants:</w:t>
+        <w:t xml:space="preserve">Capa  </w:t>
+      </w:r>
+      <w:proofErr w:type="spellStart"/>
+      <w:r>
+        <w:rPr>
+          <w:b/>
+          <w:bCs/>
+        </w:rPr>
+        <w:t>Constants</w:t>
+      </w:r>
+      <w:proofErr w:type="spellEnd"/>
+      <w:proofErr w:type="gramEnd"/>
+      <w:r>
+        <w:rPr>
+          <w:b/>
+          <w:bCs/>
+        </w:rPr>
+        <w:t>:</w:t>
       </w:r>
     </w:p>
     <w:p>
@@ -186,8 +278,26 @@
         <w:t xml:space="preserve">Utilidades para manejo de </w:t>
       </w:r>
       <w:r>
-        <w:t>contantes del sistema tipo static(mensajes, plantillas email )</w:t>
-      </w:r>
+        <w:t xml:space="preserve">contantes del sistema tipo </w:t>
+      </w:r>
+      <w:proofErr w:type="spellStart"/>
+      <w:proofErr w:type="gramStart"/>
+      <w:r>
+        <w:t>static</w:t>
+      </w:r>
+      <w:proofErr w:type="spellEnd"/>
+      <w:r>
+        <w:t>(</w:t>
+      </w:r>
+      <w:proofErr w:type="gramEnd"/>
+      <w:r>
+        <w:t xml:space="preserve">mensajes, plantillas </w:t>
+      </w:r>
+      <w:proofErr w:type="gramStart"/>
+      <w:r>
+        <w:t>email )</w:t>
+      </w:r>
+      <w:proofErr w:type="gramEnd"/>
       <w:r>
         <w:t xml:space="preserve"> </w:t>
       </w:r>
@@ -209,8 +319,17 @@
           <w:b/>
           <w:bCs/>
         </w:rPr>
-        <w:t>Capa domain</w:t>
-      </w:r>
+        <w:t xml:space="preserve">Capa </w:t>
+      </w:r>
+      <w:proofErr w:type="spellStart"/>
+      <w:r>
+        <w:rPr>
+          <w:b/>
+          <w:bCs/>
+        </w:rPr>
+        <w:t>domain</w:t>
+      </w:r>
+      <w:proofErr w:type="spellEnd"/>
     </w:p>
     <w:p>
       <w:pPr>
@@ -231,6 +350,7 @@
         </w:rPr>
         <w:t xml:space="preserve">Capa </w:t>
       </w:r>
+      <w:proofErr w:type="spellStart"/>
       <w:r>
         <w:rPr>
           <w:b/>
@@ -238,6 +358,7 @@
         </w:rPr>
         <w:t>Helpers</w:t>
       </w:r>
+      <w:proofErr w:type="spellEnd"/>
     </w:p>
     <w:p>
       <w:pPr>
@@ -256,8 +377,17 @@
           <w:b/>
           <w:bCs/>
         </w:rPr>
-        <w:t>Access dependency</w:t>
-      </w:r>
+        <w:t xml:space="preserve">Access </w:t>
+      </w:r>
+      <w:proofErr w:type="spellStart"/>
+      <w:r>
+        <w:rPr>
+          <w:b/>
+          <w:bCs/>
+        </w:rPr>
+        <w:t>dependency</w:t>
+      </w:r>
+      <w:proofErr w:type="spellEnd"/>
     </w:p>
     <w:p>
       <w:pPr>
@@ -279,9 +409,11 @@
           <w:numId w:val="1"/>
         </w:numPr>
       </w:pPr>
+      <w:proofErr w:type="spellStart"/>
       <w:r>
         <w:t>AccessDependency</w:t>
       </w:r>
+      <w:proofErr w:type="spellEnd"/>
     </w:p>
     <w:p/>
     <w:p>
@@ -291,6 +423,7 @@
           <w:numId w:val="1"/>
         </w:numPr>
       </w:pPr>
+      <w:proofErr w:type="gramStart"/>
       <w:r>
         <w:rPr>
           <w:b/>
@@ -303,7 +436,15 @@
           <w:b/>
           <w:bCs/>
         </w:rPr>
-        <w:t xml:space="preserve"> In</w:t>
+        <w:t xml:space="preserve"> </w:t>
+      </w:r>
+      <w:proofErr w:type="spellStart"/>
+      <w:r>
+        <w:rPr>
+          <w:b/>
+          <w:bCs/>
+        </w:rPr>
+        <w:t>In</w:t>
       </w:r>
       <w:r>
         <w:rPr>
@@ -319,6 +460,8 @@
         </w:rPr>
         <w:t>raestructure</w:t>
       </w:r>
+      <w:proofErr w:type="spellEnd"/>
+      <w:proofErr w:type="gramEnd"/>
       <w:r>
         <w:rPr>
           <w:b/>
@@ -336,8 +479,13 @@
         </w:numPr>
       </w:pPr>
       <w:r>
-        <w:t>Consultas a la bd</w:t>
-      </w:r>
+        <w:t xml:space="preserve">Consultas a la </w:t>
+      </w:r>
+      <w:proofErr w:type="spellStart"/>
+      <w:r>
+        <w:t>bd</w:t>
+      </w:r>
+      <w:proofErr w:type="spellEnd"/>
     </w:p>
     <w:p>
       <w:pPr>
@@ -347,12 +495,48 @@
           <w:numId w:val="1"/>
         </w:numPr>
       </w:pPr>
-      <w:r>
-        <w:t>AccesDependecy (</w:t>
-      </w:r>
-      <w:r>
-        <w:t>public static IServiceCollection AddInfrastructure(</w:t>
-      </w:r>
+      <w:proofErr w:type="spellStart"/>
+      <w:r>
+        <w:t>AccesDependecy</w:t>
+      </w:r>
+      <w:proofErr w:type="spellEnd"/>
+      <w:r>
+        <w:t xml:space="preserve"> (</w:t>
+      </w:r>
+      <w:proofErr w:type="spellStart"/>
+      <w:r>
+        <w:t>public</w:t>
+      </w:r>
+      <w:proofErr w:type="spellEnd"/>
+      <w:r>
+        <w:t xml:space="preserve"> </w:t>
+      </w:r>
+      <w:proofErr w:type="spellStart"/>
+      <w:r>
+        <w:t>static</w:t>
+      </w:r>
+      <w:proofErr w:type="spellEnd"/>
+      <w:r>
+        <w:t xml:space="preserve"> </w:t>
+      </w:r>
+      <w:proofErr w:type="spellStart"/>
+      <w:r>
+        <w:t>IServiceCollection</w:t>
+      </w:r>
+      <w:proofErr w:type="spellEnd"/>
+      <w:r>
+        <w:t xml:space="preserve"> </w:t>
+      </w:r>
+      <w:proofErr w:type="spellStart"/>
+      <w:proofErr w:type="gramStart"/>
+      <w:r>
+        <w:t>AddInfrastructure</w:t>
+      </w:r>
+      <w:proofErr w:type="spellEnd"/>
+      <w:r>
+        <w:t>(</w:t>
+      </w:r>
+      <w:proofErr w:type="gramEnd"/>
     </w:p>
     <w:p>
       <w:pPr>
@@ -360,7 +544,47 @@
         <w:ind w:left="1440"/>
       </w:pPr>
       <w:r>
-        <w:t xml:space="preserve">        this IServiceCollection services, IConfiguration configuration)</w:t>
+        <w:t xml:space="preserve">        </w:t>
+      </w:r>
+      <w:proofErr w:type="spellStart"/>
+      <w:r>
+        <w:t>this</w:t>
+      </w:r>
+      <w:proofErr w:type="spellEnd"/>
+      <w:r>
+        <w:t xml:space="preserve"> </w:t>
+      </w:r>
+      <w:proofErr w:type="spellStart"/>
+      <w:r>
+        <w:t>IServiceCollection</w:t>
+      </w:r>
+      <w:proofErr w:type="spellEnd"/>
+      <w:r>
+        <w:t xml:space="preserve"> </w:t>
+      </w:r>
+      <w:proofErr w:type="spellStart"/>
+      <w:r>
+        <w:t>services</w:t>
+      </w:r>
+      <w:proofErr w:type="spellEnd"/>
+      <w:r>
+        <w:t xml:space="preserve">, </w:t>
+      </w:r>
+      <w:proofErr w:type="spellStart"/>
+      <w:r>
+        <w:t>IConfiguration</w:t>
+      </w:r>
+      <w:proofErr w:type="spellEnd"/>
+      <w:r>
+        <w:t xml:space="preserve"> </w:t>
+      </w:r>
+      <w:proofErr w:type="spellStart"/>
+      <w:r>
+        <w:t>configuration</w:t>
+      </w:r>
+      <w:proofErr w:type="spellEnd"/>
+      <w:r>
+        <w:t>)</w:t>
       </w:r>
       <w:r>
         <w:t>)</w:t>
@@ -374,9 +598,11 @@
           <w:numId w:val="1"/>
         </w:numPr>
       </w:pPr>
+      <w:proofErr w:type="spellStart"/>
       <w:r>
         <w:t>Repositories</w:t>
       </w:r>
+      <w:proofErr w:type="spellEnd"/>
     </w:p>
     <w:p>
       <w:pPr>
@@ -410,8 +636,39 @@
       <w:r>
         <w:br/>
       </w:r>
-      <w:r>
-        <w:t>DTOs, Entity AppDbContext,Enums, Models,</w:t>
+      <w:proofErr w:type="spellStart"/>
+      <w:r>
+        <w:t>DTOs</w:t>
+      </w:r>
+      <w:proofErr w:type="spellEnd"/>
+      <w:r>
+        <w:t xml:space="preserve">, </w:t>
+      </w:r>
+      <w:proofErr w:type="spellStart"/>
+      <w:r>
+        <w:t>Entity</w:t>
+      </w:r>
+      <w:proofErr w:type="spellEnd"/>
+      <w:r>
+        <w:t xml:space="preserve"> </w:t>
+      </w:r>
+      <w:proofErr w:type="spellStart"/>
+      <w:proofErr w:type="gramStart"/>
+      <w:r>
+        <w:t>AppDbContext,Enums</w:t>
+      </w:r>
+      <w:proofErr w:type="spellEnd"/>
+      <w:proofErr w:type="gramEnd"/>
+      <w:r>
+        <w:t xml:space="preserve">, </w:t>
+      </w:r>
+      <w:proofErr w:type="spellStart"/>
+      <w:r>
+        <w:t>Models</w:t>
+      </w:r>
+      <w:proofErr w:type="spellEnd"/>
+      <w:r>
+        <w:t>,</w:t>
       </w:r>
     </w:p>
     <w:p>
@@ -422,2304 +679,6 @@
         </w:numPr>
       </w:pPr>
     </w:p>
-    <w:p>
-      <w:r>
-        <w:pict w14:anchorId="00ACCE0A">
-          <v:rect id="_x0000_i1025" style="width:0;height:1.5pt" o:hralign="center" o:hrstd="t" o:hr="t" fillcolor="#a0a0a0" stroked="f"/>
-        </w:pict>
-      </w:r>
-    </w:p>
-    <w:p>
-      <w:pPr>
-        <w:rPr>
-          <w:b/>
-          <w:bCs/>
-        </w:rPr>
-      </w:pPr>
-      <w:r>
-        <w:rPr>
-          <w:b/>
-          <w:bCs/>
-        </w:rPr>
-        <w:t>4. Requerimientos Funcionales</w:t>
-      </w:r>
-    </w:p>
-    <w:p>
-      <w:pPr>
-        <w:numPr>
-          <w:ilvl w:val="0"/>
-          <w:numId w:val="2"/>
-        </w:numPr>
-      </w:pPr>
-      <w:r>
-        <w:lastRenderedPageBreak/>
-        <w:t>Registro del profesional.</w:t>
-      </w:r>
-    </w:p>
-    <w:p>
-      <w:pPr>
-        <w:numPr>
-          <w:ilvl w:val="0"/>
-          <w:numId w:val="2"/>
-        </w:numPr>
-      </w:pPr>
-      <w:r>
-        <w:t>Carga de documentos requeridos:</w:t>
-      </w:r>
-    </w:p>
-    <w:p>
-      <w:pPr>
-        <w:numPr>
-          <w:ilvl w:val="1"/>
-          <w:numId w:val="2"/>
-        </w:numPr>
-      </w:pPr>
-      <w:r>
-        <w:t>Documento de identidad.</w:t>
-      </w:r>
-    </w:p>
-    <w:p>
-      <w:pPr>
-        <w:numPr>
-          <w:ilvl w:val="1"/>
-          <w:numId w:val="2"/>
-        </w:numPr>
-      </w:pPr>
-      <w:r>
-        <w:t>Certificado profesional.</w:t>
-      </w:r>
-    </w:p>
-    <w:p>
-      <w:pPr>
-        <w:numPr>
-          <w:ilvl w:val="0"/>
-          <w:numId w:val="2"/>
-        </w:numPr>
-      </w:pPr>
-      <w:r>
-        <w:t>Validación manual por parte del administrador.</w:t>
-      </w:r>
-    </w:p>
-    <w:p>
-      <w:pPr>
-        <w:numPr>
-          <w:ilvl w:val="0"/>
-          <w:numId w:val="2"/>
-        </w:numPr>
-      </w:pPr>
-      <w:r>
-        <w:t>Activación del perfil profesional tras la validación.</w:t>
-      </w:r>
-    </w:p>
-    <w:p>
-      <w:pPr>
-        <w:numPr>
-          <w:ilvl w:val="0"/>
-          <w:numId w:val="2"/>
-        </w:numPr>
-      </w:pPr>
-      <w:r>
-        <w:t>Creación y configuración de salas virtuales (nombre, descripción, cupos, modalidad).</w:t>
-      </w:r>
-    </w:p>
-    <w:p>
-      <w:pPr>
-        <w:numPr>
-          <w:ilvl w:val="0"/>
-          <w:numId w:val="2"/>
-        </w:numPr>
-      </w:pPr>
-      <w:r>
-        <w:t>Definición de precios y tiempos de sesiones.</w:t>
-      </w:r>
-    </w:p>
-    <w:p>
-      <w:pPr>
-        <w:numPr>
-          <w:ilvl w:val="0"/>
-          <w:numId w:val="2"/>
-        </w:numPr>
-      </w:pPr>
-      <w:r>
-        <w:t>Habilita</w:t>
-      </w:r>
-      <w:r>
-        <w:t>r</w:t>
-      </w:r>
-      <w:r>
-        <w:t xml:space="preserve"> o deshabilita</w:t>
-      </w:r>
-      <w:r>
-        <w:t>r</w:t>
-      </w:r>
-      <w:r>
-        <w:t xml:space="preserve"> de salas.</w:t>
-      </w:r>
-    </w:p>
-    <w:p>
-      <w:pPr>
-        <w:numPr>
-          <w:ilvl w:val="0"/>
-          <w:numId w:val="2"/>
-        </w:numPr>
-      </w:pPr>
-      <w:r>
-        <w:t>Visualización de usuarios inscritos en sus salas.</w:t>
-      </w:r>
-    </w:p>
-    <w:p>
-      <w:pPr>
-        <w:numPr>
-          <w:ilvl w:val="0"/>
-          <w:numId w:val="2"/>
-        </w:numPr>
-      </w:pPr>
-      <w:r>
-        <w:t>Recepción de pagos y control de ingresos.</w:t>
-      </w:r>
-    </w:p>
-    <w:p>
-      <w:pPr>
-        <w:numPr>
-          <w:ilvl w:val="0"/>
-          <w:numId w:val="2"/>
-        </w:numPr>
-      </w:pPr>
-      <w:r>
-        <w:t>Panel de control con métricas y reportes.</w:t>
-      </w:r>
-    </w:p>
-    <w:p>
-      <w:pPr>
-        <w:numPr>
-          <w:ilvl w:val="0"/>
-          <w:numId w:val="2"/>
-        </w:numPr>
-      </w:pPr>
-      <w:r>
-        <w:t>Cierre automático de sesión por inactividad.</w:t>
-      </w:r>
-    </w:p>
-    <w:p>
-      <w:r>
-        <w:pict w14:anchorId="0068F854">
-          <v:rect id="_x0000_i1026" style="width:0;height:1.5pt" o:hralign="center" o:hrstd="t" o:hr="t" fillcolor="#a0a0a0" stroked="f"/>
-        </w:pict>
-      </w:r>
-    </w:p>
-    <w:p>
-      <w:pPr>
-        <w:rPr>
-          <w:b/>
-          <w:bCs/>
-        </w:rPr>
-      </w:pPr>
-      <w:r>
-        <w:rPr>
-          <w:b/>
-          <w:bCs/>
-        </w:rPr>
-        <w:t>5. Requerimientos No Funcionales</w:t>
-      </w:r>
-    </w:p>
-    <w:p>
-      <w:pPr>
-        <w:numPr>
-          <w:ilvl w:val="0"/>
-          <w:numId w:val="3"/>
-        </w:numPr>
-      </w:pPr>
-      <w:r>
-        <w:rPr>
-          <w:b/>
-          <w:bCs/>
-        </w:rPr>
-        <w:t>Seguridad:</w:t>
-      </w:r>
-      <w:r>
-        <w:t xml:space="preserve"> Validación de identidad y certificaciones antes de habilitar la cuenta.</w:t>
-      </w:r>
-    </w:p>
-    <w:p>
-      <w:pPr>
-        <w:numPr>
-          <w:ilvl w:val="0"/>
-          <w:numId w:val="3"/>
-        </w:numPr>
-      </w:pPr>
-      <w:r>
-        <w:rPr>
-          <w:b/>
-          <w:bCs/>
-        </w:rPr>
-        <w:t>Integridad:</w:t>
-      </w:r>
-      <w:r>
-        <w:t xml:space="preserve"> Los documentos se almacenan </w:t>
-      </w:r>
-      <w:r>
-        <w:t>en el correo del sistema</w:t>
-      </w:r>
-    </w:p>
-    <w:p>
-      <w:pPr>
-        <w:numPr>
-          <w:ilvl w:val="0"/>
-          <w:numId w:val="3"/>
-        </w:numPr>
-      </w:pPr>
-      <w:r>
-        <w:rPr>
-          <w:b/>
-          <w:bCs/>
-        </w:rPr>
-        <w:t>Rendimiento:</w:t>
-      </w:r>
-      <w:r>
-        <w:t xml:space="preserve"> Listados de salas y usuarios deben cargar en menos de 2 segundos.</w:t>
-      </w:r>
-    </w:p>
-    <w:p>
-      <w:pPr>
-        <w:numPr>
-          <w:ilvl w:val="0"/>
-          <w:numId w:val="3"/>
-        </w:numPr>
-      </w:pPr>
-      <w:r>
-        <w:rPr>
-          <w:b/>
-          <w:bCs/>
-        </w:rPr>
-        <w:t>Escalabilidad:</w:t>
-      </w:r>
-      <w:r>
-        <w:t xml:space="preserve"> Permitir crecimiento de salas y sesiones simultáneas.</w:t>
-      </w:r>
-    </w:p>
-    <w:p>
-      <w:pPr>
-        <w:numPr>
-          <w:ilvl w:val="0"/>
-          <w:numId w:val="3"/>
-        </w:numPr>
-      </w:pPr>
-      <w:r>
-        <w:rPr>
-          <w:b/>
-          <w:bCs/>
-        </w:rPr>
-        <w:t>Usabilidad:</w:t>
-      </w:r>
-      <w:r>
-        <w:t xml:space="preserve"> Panel profesional intuitivo y adaptable a pantallas grandes.</w:t>
-      </w:r>
-    </w:p>
-    <w:p>
-      <w:pPr>
-        <w:numPr>
-          <w:ilvl w:val="0"/>
-          <w:numId w:val="3"/>
-        </w:numPr>
-      </w:pPr>
-      <w:r>
-        <w:rPr>
-          <w:b/>
-          <w:bCs/>
-        </w:rPr>
-        <w:t>Mantenibilidad:</w:t>
-      </w:r>
-      <w:r>
-        <w:t xml:space="preserve"> Código desacoplado mediante servicios y repositorios.</w:t>
-      </w:r>
-    </w:p>
-    <w:p>
-      <w:r>
-        <w:pict w14:anchorId="560B65D0">
-          <v:rect id="_x0000_i1027" style="width:0;height:1.5pt" o:hralign="center" o:hrstd="t" o:hr="t" fillcolor="#a0a0a0" stroked="f"/>
-        </w:pict>
-      </w:r>
-    </w:p>
-    <w:p>
-      <w:pPr>
-        <w:rPr>
-          <w:b/>
-          <w:bCs/>
-        </w:rPr>
-      </w:pPr>
-      <w:r>
-        <w:rPr>
-          <w:b/>
-          <w:bCs/>
-        </w:rPr>
-        <w:t>6. Flujo Funcional – Perfil Profesional</w:t>
-      </w:r>
-    </w:p>
-    <w:p>
-      <w:pPr>
-        <w:rPr>
-          <w:b/>
-          <w:bCs/>
-        </w:rPr>
-      </w:pPr>
-      <w:r>
-        <w:rPr>
-          <w:b/>
-          <w:bCs/>
-        </w:rPr>
-        <w:t>6.1 Registro y Validación</w:t>
-      </w:r>
-    </w:p>
-    <w:p>
-      <w:pPr>
-        <w:numPr>
-          <w:ilvl w:val="0"/>
-          <w:numId w:val="4"/>
-        </w:numPr>
-      </w:pPr>
-      <w:r>
-        <w:lastRenderedPageBreak/>
-        <w:t>El profesional selecciona “Registrarse como profesional”.</w:t>
-      </w:r>
-    </w:p>
-    <w:p>
-      <w:pPr>
-        <w:numPr>
-          <w:ilvl w:val="0"/>
-          <w:numId w:val="4"/>
-        </w:numPr>
-      </w:pPr>
-      <w:r>
-        <w:t>Completa formulario de datos básicos</w:t>
-      </w:r>
-      <w:r>
-        <w:t xml:space="preserve"> + documentos</w:t>
-      </w:r>
-      <w:r>
-        <w:t>.</w:t>
-      </w:r>
-    </w:p>
-    <w:p>
-      <w:pPr>
-        <w:numPr>
-          <w:ilvl w:val="0"/>
-          <w:numId w:val="4"/>
-        </w:numPr>
-      </w:pPr>
-      <w:r>
-        <w:t>Se genera cuenta inactiva hasta que cargue documentos.</w:t>
-      </w:r>
-    </w:p>
-    <w:p>
-      <w:pPr>
-        <w:numPr>
-          <w:ilvl w:val="0"/>
-          <w:numId w:val="4"/>
-        </w:numPr>
-      </w:pPr>
-      <w:r>
-        <w:t>El sistema envía correo</w:t>
-      </w:r>
-      <w:r>
-        <w:t xml:space="preserve"> al profesional</w:t>
-      </w:r>
-      <w:r>
-        <w:t xml:space="preserve"> con enlace de validación.</w:t>
-      </w:r>
-    </w:p>
-    <w:p>
-      <w:pPr>
-        <w:numPr>
-          <w:ilvl w:val="0"/>
-          <w:numId w:val="4"/>
-        </w:numPr>
-      </w:pPr>
-      <w:r>
-        <w:t>El administrador valida la información y habilita la cuenta.</w:t>
-      </w:r>
-    </w:p>
-    <w:p>
-      <w:pPr>
-        <w:numPr>
-          <w:ilvl w:val="0"/>
-          <w:numId w:val="4"/>
-        </w:numPr>
-      </w:pPr>
-      <w:r>
-        <w:t>El sistema manda los datos y adjuntos al correo del sistema</w:t>
-      </w:r>
-    </w:p>
-    <w:p>
-      <w:pPr>
-        <w:numPr>
-          <w:ilvl w:val="0"/>
-          <w:numId w:val="4"/>
-        </w:numPr>
-      </w:pPr>
-      <w:r>
-        <w:t>El administrador del sistema valida los documentos y aprueba</w:t>
-      </w:r>
-    </w:p>
-    <w:p>
-      <w:pPr>
-        <w:numPr>
-          <w:ilvl w:val="0"/>
-          <w:numId w:val="4"/>
-        </w:numPr>
-      </w:pPr>
-      <w:r>
-        <w:t>El sistema manda mensaje de aprobación al profesional y habilita la cuenta</w:t>
-      </w:r>
-    </w:p>
-    <w:p>
-      <w:pPr>
-        <w:numPr>
-          <w:ilvl w:val="0"/>
-          <w:numId w:val="4"/>
-        </w:numPr>
-      </w:pPr>
-      <w:r>
-        <w:t xml:space="preserve">En correo de aprobación envia enlace con tocken para establecer la contraseña con vencimiento de un día </w:t>
-      </w:r>
-    </w:p>
-    <w:p>
-      <w:pPr>
-        <w:rPr>
-          <w:b/>
-          <w:bCs/>
-        </w:rPr>
-      </w:pPr>
-      <w:r>
-        <w:rPr>
-          <w:b/>
-          <w:bCs/>
-        </w:rPr>
-        <w:t>6.2 Creación de Salas</w:t>
-      </w:r>
-    </w:p>
-    <w:p>
-      <w:pPr>
-        <w:numPr>
-          <w:ilvl w:val="0"/>
-          <w:numId w:val="5"/>
-        </w:numPr>
-      </w:pPr>
-      <w:r>
-        <w:t>Desde el panel, el profesional ingresa a “Mis Salas”.</w:t>
-      </w:r>
-    </w:p>
-    <w:p>
-      <w:pPr>
-        <w:numPr>
-          <w:ilvl w:val="0"/>
-          <w:numId w:val="5"/>
-        </w:numPr>
-      </w:pPr>
-      <w:r>
-        <w:t>Da clic en “Crear nueva sala”.</w:t>
-      </w:r>
-    </w:p>
-    <w:p>
-      <w:pPr>
-        <w:numPr>
-          <w:ilvl w:val="0"/>
-          <w:numId w:val="5"/>
-        </w:numPr>
-      </w:pPr>
-      <w:r>
-        <w:t>Configura:</w:t>
-      </w:r>
-    </w:p>
-    <w:p>
-      <w:pPr>
-        <w:numPr>
-          <w:ilvl w:val="1"/>
-          <w:numId w:val="5"/>
-        </w:numPr>
-      </w:pPr>
-      <w:r>
-        <w:t>Nombre</w:t>
-      </w:r>
-    </w:p>
-    <w:p>
-      <w:pPr>
-        <w:numPr>
-          <w:ilvl w:val="1"/>
-          <w:numId w:val="5"/>
-        </w:numPr>
-      </w:pPr>
-      <w:r>
-        <w:t>Tipo (paga o libre)</w:t>
-      </w:r>
-    </w:p>
-    <w:p>
-      <w:pPr>
-        <w:numPr>
-          <w:ilvl w:val="1"/>
-          <w:numId w:val="5"/>
-        </w:numPr>
-      </w:pPr>
-      <w:r>
-        <w:t>Cupo máximo de usuarios</w:t>
-      </w:r>
-    </w:p>
-    <w:p>
-      <w:pPr>
-        <w:numPr>
-          <w:ilvl w:val="1"/>
-          <w:numId w:val="5"/>
-        </w:numPr>
-      </w:pPr>
-      <w:r>
-        <w:t>Precio (si aplica)</w:t>
-      </w:r>
-    </w:p>
-    <w:p>
-      <w:pPr>
-        <w:numPr>
-          <w:ilvl w:val="1"/>
-          <w:numId w:val="5"/>
-        </w:numPr>
-      </w:pPr>
-      <w:r>
-        <w:t>Descripción</w:t>
-      </w:r>
-    </w:p>
-    <w:p>
-      <w:pPr>
-        <w:numPr>
-          <w:ilvl w:val="0"/>
-          <w:numId w:val="5"/>
-        </w:numPr>
-      </w:pPr>
-      <w:r>
-        <w:t>Guarda y habilita la sala.</w:t>
-      </w:r>
-    </w:p>
-    <w:p>
-      <w:pPr>
-        <w:numPr>
-          <w:ilvl w:val="0"/>
-          <w:numId w:val="5"/>
-        </w:numPr>
-      </w:pPr>
-      <w:r>
-        <w:t>El sistema la hace visible a los usuarios.</w:t>
-      </w:r>
-    </w:p>
-    <w:p>
-      <w:pPr>
-        <w:rPr>
-          <w:b/>
-          <w:bCs/>
-        </w:rPr>
-      </w:pPr>
-      <w:r>
-        <w:rPr>
-          <w:b/>
-          <w:bCs/>
-        </w:rPr>
-        <w:t>6.3 Gestión de Usuarios en Sala</w:t>
-      </w:r>
-    </w:p>
-    <w:p>
-      <w:pPr>
-        <w:numPr>
-          <w:ilvl w:val="0"/>
-          <w:numId w:val="6"/>
-        </w:numPr>
-      </w:pPr>
-      <w:r>
-        <w:t>Visualiza la lista de usuarios inscritos.</w:t>
-      </w:r>
-    </w:p>
-    <w:p>
-      <w:pPr>
-        <w:numPr>
-          <w:ilvl w:val="0"/>
-          <w:numId w:val="6"/>
-        </w:numPr>
-      </w:pPr>
-      <w:r>
-        <w:t>Puede aceptar, expulsar o bloquear acceso.</w:t>
-      </w:r>
-    </w:p>
-    <w:p>
-      <w:pPr>
-        <w:numPr>
-          <w:ilvl w:val="0"/>
-          <w:numId w:val="6"/>
-        </w:numPr>
-      </w:pPr>
-      <w:r>
-        <w:t>Controla la capacidad máxima en tiempo real.</w:t>
-      </w:r>
-    </w:p>
-    <w:p>
-      <w:pPr>
-        <w:rPr>
-          <w:b/>
-          <w:bCs/>
-        </w:rPr>
-      </w:pPr>
-      <w:r>
-        <w:rPr>
-          <w:b/>
-          <w:bCs/>
-        </w:rPr>
-        <w:t>6.4 Pagos y Liquidaciones</w:t>
-      </w:r>
-    </w:p>
-    <w:p>
-      <w:pPr>
-        <w:numPr>
-          <w:ilvl w:val="0"/>
-          <w:numId w:val="7"/>
-        </w:numPr>
-      </w:pPr>
-      <w:r>
-        <w:lastRenderedPageBreak/>
-        <w:t>Los usuarios pagan acceso a salas pagas.</w:t>
-      </w:r>
-    </w:p>
-    <w:p>
-      <w:pPr>
-        <w:numPr>
-          <w:ilvl w:val="0"/>
-          <w:numId w:val="7"/>
-        </w:numPr>
-      </w:pPr>
-      <w:r>
-        <w:t>El sistema retiene comisión (definida en parámetros globales).</w:t>
-      </w:r>
-    </w:p>
-    <w:p>
-      <w:pPr>
-        <w:numPr>
-          <w:ilvl w:val="0"/>
-          <w:numId w:val="7"/>
-        </w:numPr>
-      </w:pPr>
-      <w:r>
-        <w:t>El profesional visualiza su saldo acumulado y pagos por sesión.</w:t>
-      </w:r>
-    </w:p>
-    <w:p>
-      <w:pPr>
-        <w:numPr>
-          <w:ilvl w:val="0"/>
-          <w:numId w:val="7"/>
-        </w:numPr>
-      </w:pPr>
-      <w:r>
-        <w:t>Puede descargar reportes o comprobantes.</w:t>
-      </w:r>
-    </w:p>
-    <w:p>
-      <w:pPr>
-        <w:rPr>
-          <w:b/>
-          <w:bCs/>
-        </w:rPr>
-      </w:pPr>
-      <w:r>
-        <w:rPr>
-          <w:b/>
-          <w:bCs/>
-        </w:rPr>
-        <w:t>6.5 Panel de Control Profesional</w:t>
-      </w:r>
-    </w:p>
-    <w:p>
-      <w:pPr>
-        <w:numPr>
-          <w:ilvl w:val="0"/>
-          <w:numId w:val="8"/>
-        </w:numPr>
-      </w:pPr>
-      <w:r>
-        <w:t>Muestra:</w:t>
-      </w:r>
-    </w:p>
-    <w:p>
-      <w:pPr>
-        <w:numPr>
-          <w:ilvl w:val="1"/>
-          <w:numId w:val="8"/>
-        </w:numPr>
-      </w:pPr>
-      <w:r>
-        <w:t>Ingresos totales.</w:t>
-      </w:r>
-    </w:p>
-    <w:p>
-      <w:pPr>
-        <w:numPr>
-          <w:ilvl w:val="1"/>
-          <w:numId w:val="8"/>
-        </w:numPr>
-      </w:pPr>
-      <w:r>
-        <w:t>Usuarios atendidos.</w:t>
-      </w:r>
-    </w:p>
-    <w:p>
-      <w:pPr>
-        <w:numPr>
-          <w:ilvl w:val="1"/>
-          <w:numId w:val="8"/>
-        </w:numPr>
-      </w:pPr>
-      <w:r>
-        <w:t>Sesiones realizadas.</w:t>
-      </w:r>
-    </w:p>
-    <w:p>
-      <w:pPr>
-        <w:numPr>
-          <w:ilvl w:val="1"/>
-          <w:numId w:val="8"/>
-        </w:numPr>
-      </w:pPr>
-      <w:r>
-        <w:t>Salas activas/inactivas.</w:t>
-      </w:r>
-    </w:p>
-    <w:p>
-      <w:pPr>
-        <w:numPr>
-          <w:ilvl w:val="0"/>
-          <w:numId w:val="8"/>
-        </w:numPr>
-      </w:pPr>
-      <w:r>
-        <w:t>Permite edición de perfil profesional.</w:t>
-      </w:r>
-    </w:p>
-    <w:p>
-      <w:pPr>
-        <w:rPr>
-          <w:b/>
-          <w:bCs/>
-        </w:rPr>
-      </w:pPr>
-      <w:r>
-        <w:rPr>
-          <w:b/>
-          <w:bCs/>
-        </w:rPr>
-        <w:t>6.6 Cierre Automático por Inactividad</w:t>
-      </w:r>
-    </w:p>
-    <w:p>
-      <w:pPr>
-        <w:numPr>
-          <w:ilvl w:val="0"/>
-          <w:numId w:val="9"/>
-        </w:numPr>
-      </w:pPr>
-      <w:r>
-        <w:t>Middleware idéntico al del perfil usuario (SessionExpirationMiddleware).</w:t>
-      </w:r>
-    </w:p>
-    <w:p>
-      <w:pPr>
-        <w:numPr>
-          <w:ilvl w:val="0"/>
-          <w:numId w:val="9"/>
-        </w:numPr>
-      </w:pPr>
-      <w:r>
-        <w:t>Control configurable desde appsettings.json.</w:t>
-      </w:r>
-    </w:p>
-    <w:p>
-      <w:r>
-        <w:pict w14:anchorId="0E4DC3DA">
-          <v:rect id="_x0000_i1028" style="width:0;height:1.5pt" o:hralign="center" o:hrstd="t" o:hr="t" fillcolor="#a0a0a0" stroked="f"/>
-        </w:pict>
-      </w:r>
-    </w:p>
-    <w:p>
-      <w:r>
-        <w:pict w14:anchorId="585F43C2">
-          <v:rect id="_x0000_i1029" style="width:0;height:1.5pt" o:hralign="center" o:hrstd="t" o:hr="t" fillcolor="#a0a0a0" stroked="f"/>
-        </w:pict>
-      </w:r>
-    </w:p>
-    <w:p>
-      <w:pPr>
-        <w:rPr>
-          <w:b/>
-          <w:bCs/>
-        </w:rPr>
-      </w:pPr>
-      <w:r>
-        <w:rPr>
-          <w:b/>
-          <w:bCs/>
-        </w:rPr>
-        <w:t>8. Product Backlog (General)</w:t>
-      </w:r>
-    </w:p>
-    <w:tbl>
-      <w:tblPr>
-        <w:tblW w:w="0" w:type="auto"/>
-        <w:tblCellSpacing w:w="15" w:type="dxa"/>
-        <w:tblCellMar>
-          <w:top w:w="15" w:type="dxa"/>
-          <w:left w:w="15" w:type="dxa"/>
-          <w:bottom w:w="15" w:type="dxa"/>
-          <w:right w:w="15" w:type="dxa"/>
-        </w:tblCellMar>
-        <w:tblLook w:val="04A0" w:firstRow="1" w:lastRow="0" w:firstColumn="1" w:lastColumn="0" w:noHBand="0" w:noVBand="1"/>
-      </w:tblPr>
-      <w:tblGrid>
-        <w:gridCol w:w="678"/>
-        <w:gridCol w:w="3489"/>
-        <w:gridCol w:w="1061"/>
-        <w:gridCol w:w="1157"/>
-      </w:tblGrid>
-      <w:tr>
-        <w:trPr>
-          <w:tblHeader/>
-          <w:tblCellSpacing w:w="15" w:type="dxa"/>
-        </w:trPr>
-        <w:tc>
-          <w:tcPr>
-            <w:tcW w:w="0" w:type="auto"/>
-            <w:vAlign w:val="center"/>
-            <w:hideMark/>
-          </w:tcPr>
-          <w:p>
-            <w:pPr>
-              <w:rPr>
-                <w:b/>
-                <w:bCs/>
-              </w:rPr>
-            </w:pPr>
-            <w:r>
-              <w:rPr>
-                <w:b/>
-                <w:bCs/>
-              </w:rPr>
-              <w:t>ID</w:t>
-            </w:r>
-          </w:p>
-        </w:tc>
-        <w:tc>
-          <w:tcPr>
-            <w:tcW w:w="0" w:type="auto"/>
-            <w:vAlign w:val="center"/>
-            <w:hideMark/>
-          </w:tcPr>
-          <w:p>
-            <w:pPr>
-              <w:rPr>
-                <w:b/>
-                <w:bCs/>
-              </w:rPr>
-            </w:pPr>
-            <w:r>
-              <w:rPr>
-                <w:b/>
-                <w:bCs/>
-              </w:rPr>
-              <w:t>Funcionalidad</w:t>
-            </w:r>
-          </w:p>
-        </w:tc>
-        <w:tc>
-          <w:tcPr>
-            <w:tcW w:w="0" w:type="auto"/>
-            <w:vAlign w:val="center"/>
-            <w:hideMark/>
-          </w:tcPr>
-          <w:p>
-            <w:pPr>
-              <w:rPr>
-                <w:b/>
-                <w:bCs/>
-              </w:rPr>
-            </w:pPr>
-            <w:r>
-              <w:rPr>
-                <w:b/>
-                <w:bCs/>
-              </w:rPr>
-              <w:t>Prioridad</w:t>
-            </w:r>
-          </w:p>
-        </w:tc>
-        <w:tc>
-          <w:tcPr>
-            <w:tcW w:w="0" w:type="auto"/>
-            <w:vAlign w:val="center"/>
-            <w:hideMark/>
-          </w:tcPr>
-          <w:p>
-            <w:pPr>
-              <w:rPr>
-                <w:b/>
-                <w:bCs/>
-              </w:rPr>
-            </w:pPr>
-            <w:r>
-              <w:rPr>
-                <w:b/>
-                <w:bCs/>
-              </w:rPr>
-              <w:t>Tipo</w:t>
-            </w:r>
-          </w:p>
-        </w:tc>
-      </w:tr>
-      <w:tr>
-        <w:trPr>
-          <w:tblCellSpacing w:w="15" w:type="dxa"/>
-        </w:trPr>
-        <w:tc>
-          <w:tcPr>
-            <w:tcW w:w="0" w:type="auto"/>
-            <w:vAlign w:val="center"/>
-            <w:hideMark/>
-          </w:tcPr>
-          <w:p>
-            <w:r>
-              <w:t>PF-01</w:t>
-            </w:r>
-          </w:p>
-        </w:tc>
-        <w:tc>
-          <w:tcPr>
-            <w:tcW w:w="0" w:type="auto"/>
-            <w:vAlign w:val="center"/>
-            <w:hideMark/>
-          </w:tcPr>
-          <w:p>
-            <w:r>
-              <w:t>Registro profesional</w:t>
-            </w:r>
-          </w:p>
-        </w:tc>
-        <w:tc>
-          <w:tcPr>
-            <w:tcW w:w="0" w:type="auto"/>
-            <w:vAlign w:val="center"/>
-            <w:hideMark/>
-          </w:tcPr>
-          <w:p>
-            <w:r>
-              <w:t>Alta</w:t>
-            </w:r>
-          </w:p>
-        </w:tc>
-        <w:tc>
-          <w:tcPr>
-            <w:tcW w:w="0" w:type="auto"/>
-            <w:vAlign w:val="center"/>
-            <w:hideMark/>
-          </w:tcPr>
-          <w:p>
-            <w:r>
-              <w:t>Core</w:t>
-            </w:r>
-          </w:p>
-        </w:tc>
-      </w:tr>
-      <w:tr>
-        <w:trPr>
-          <w:tblCellSpacing w:w="15" w:type="dxa"/>
-        </w:trPr>
-        <w:tc>
-          <w:tcPr>
-            <w:tcW w:w="0" w:type="auto"/>
-            <w:vAlign w:val="center"/>
-            <w:hideMark/>
-          </w:tcPr>
-          <w:p>
-            <w:r>
-              <w:t>PF-02</w:t>
-            </w:r>
-          </w:p>
-        </w:tc>
-        <w:tc>
-          <w:tcPr>
-            <w:tcW w:w="0" w:type="auto"/>
-            <w:vAlign w:val="center"/>
-            <w:hideMark/>
-          </w:tcPr>
-          <w:p>
-            <w:r>
-              <w:t>Carga de documentos</w:t>
-            </w:r>
-          </w:p>
-        </w:tc>
-        <w:tc>
-          <w:tcPr>
-            <w:tcW w:w="0" w:type="auto"/>
-            <w:vAlign w:val="center"/>
-            <w:hideMark/>
-          </w:tcPr>
-          <w:p>
-            <w:r>
-              <w:t>Alta</w:t>
-            </w:r>
-          </w:p>
-        </w:tc>
-        <w:tc>
-          <w:tcPr>
-            <w:tcW w:w="0" w:type="auto"/>
-            <w:vAlign w:val="center"/>
-            <w:hideMark/>
-          </w:tcPr>
-          <w:p>
-            <w:r>
-              <w:t>Core</w:t>
-            </w:r>
-          </w:p>
-        </w:tc>
-      </w:tr>
-      <w:tr>
-        <w:trPr>
-          <w:tblCellSpacing w:w="15" w:type="dxa"/>
-        </w:trPr>
-        <w:tc>
-          <w:tcPr>
-            <w:tcW w:w="0" w:type="auto"/>
-            <w:vAlign w:val="center"/>
-            <w:hideMark/>
-          </w:tcPr>
-          <w:p>
-            <w:r>
-              <w:t>PF-03</w:t>
-            </w:r>
-          </w:p>
-        </w:tc>
-        <w:tc>
-          <w:tcPr>
-            <w:tcW w:w="0" w:type="auto"/>
-            <w:vAlign w:val="center"/>
-            <w:hideMark/>
-          </w:tcPr>
-          <w:p>
-            <w:r>
-              <w:t>Validación administrativa</w:t>
-            </w:r>
-          </w:p>
-        </w:tc>
-        <w:tc>
-          <w:tcPr>
-            <w:tcW w:w="0" w:type="auto"/>
-            <w:vAlign w:val="center"/>
-            <w:hideMark/>
-          </w:tcPr>
-          <w:p>
-            <w:r>
-              <w:t>Alta</w:t>
-            </w:r>
-          </w:p>
-        </w:tc>
-        <w:tc>
-          <w:tcPr>
-            <w:tcW w:w="0" w:type="auto"/>
-            <w:vAlign w:val="center"/>
-            <w:hideMark/>
-          </w:tcPr>
-          <w:p>
-            <w:r>
-              <w:t>Control</w:t>
-            </w:r>
-          </w:p>
-        </w:tc>
-      </w:tr>
-      <w:tr>
-        <w:trPr>
-          <w:tblCellSpacing w:w="15" w:type="dxa"/>
-        </w:trPr>
-        <w:tc>
-          <w:tcPr>
-            <w:tcW w:w="0" w:type="auto"/>
-            <w:vAlign w:val="center"/>
-            <w:hideMark/>
-          </w:tcPr>
-          <w:p>
-            <w:r>
-              <w:t>PF-04</w:t>
-            </w:r>
-          </w:p>
-        </w:tc>
-        <w:tc>
-          <w:tcPr>
-            <w:tcW w:w="0" w:type="auto"/>
-            <w:vAlign w:val="center"/>
-            <w:hideMark/>
-          </w:tcPr>
-          <w:p>
-            <w:r>
-              <w:t>Activación de cuenta profesional</w:t>
-            </w:r>
-          </w:p>
-        </w:tc>
-        <w:tc>
-          <w:tcPr>
-            <w:tcW w:w="0" w:type="auto"/>
-            <w:vAlign w:val="center"/>
-            <w:hideMark/>
-          </w:tcPr>
-          <w:p>
-            <w:r>
-              <w:t>Alta</w:t>
-            </w:r>
-          </w:p>
-        </w:tc>
-        <w:tc>
-          <w:tcPr>
-            <w:tcW w:w="0" w:type="auto"/>
-            <w:vAlign w:val="center"/>
-            <w:hideMark/>
-          </w:tcPr>
-          <w:p>
-            <w:r>
-              <w:t>Core</w:t>
-            </w:r>
-          </w:p>
-        </w:tc>
-      </w:tr>
-      <w:tr>
-        <w:trPr>
-          <w:tblCellSpacing w:w="15" w:type="dxa"/>
-        </w:trPr>
-        <w:tc>
-          <w:tcPr>
-            <w:tcW w:w="0" w:type="auto"/>
-            <w:vAlign w:val="center"/>
-            <w:hideMark/>
-          </w:tcPr>
-          <w:p>
-            <w:r>
-              <w:t>PF-05</w:t>
-            </w:r>
-          </w:p>
-        </w:tc>
-        <w:tc>
-          <w:tcPr>
-            <w:tcW w:w="0" w:type="auto"/>
-            <w:vAlign w:val="center"/>
-            <w:hideMark/>
-          </w:tcPr>
-          <w:p>
-            <w:r>
-              <w:t>Creación de salas</w:t>
-            </w:r>
-          </w:p>
-        </w:tc>
-        <w:tc>
-          <w:tcPr>
-            <w:tcW w:w="0" w:type="auto"/>
-            <w:vAlign w:val="center"/>
-            <w:hideMark/>
-          </w:tcPr>
-          <w:p>
-            <w:r>
-              <w:t>Alta</w:t>
-            </w:r>
-          </w:p>
-        </w:tc>
-        <w:tc>
-          <w:tcPr>
-            <w:tcW w:w="0" w:type="auto"/>
-            <w:vAlign w:val="center"/>
-            <w:hideMark/>
-          </w:tcPr>
-          <w:p>
-            <w:r>
-              <w:t>Funcional</w:t>
-            </w:r>
-          </w:p>
-        </w:tc>
-      </w:tr>
-      <w:tr>
-        <w:trPr>
-          <w:tblCellSpacing w:w="15" w:type="dxa"/>
-        </w:trPr>
-        <w:tc>
-          <w:tcPr>
-            <w:tcW w:w="0" w:type="auto"/>
-            <w:vAlign w:val="center"/>
-            <w:hideMark/>
-          </w:tcPr>
-          <w:p>
-            <w:r>
-              <w:t>PF-06</w:t>
-            </w:r>
-          </w:p>
-        </w:tc>
-        <w:tc>
-          <w:tcPr>
-            <w:tcW w:w="0" w:type="auto"/>
-            <w:vAlign w:val="center"/>
-            <w:hideMark/>
-          </w:tcPr>
-          <w:p>
-            <w:r>
-              <w:t>Gestión de usuarios en salas</w:t>
-            </w:r>
-          </w:p>
-        </w:tc>
-        <w:tc>
-          <w:tcPr>
-            <w:tcW w:w="0" w:type="auto"/>
-            <w:vAlign w:val="center"/>
-            <w:hideMark/>
-          </w:tcPr>
-          <w:p>
-            <w:r>
-              <w:t>Media</w:t>
-            </w:r>
-          </w:p>
-        </w:tc>
-        <w:tc>
-          <w:tcPr>
-            <w:tcW w:w="0" w:type="auto"/>
-            <w:vAlign w:val="center"/>
-            <w:hideMark/>
-          </w:tcPr>
-          <w:p>
-            <w:r>
-              <w:t>Funcional</w:t>
-            </w:r>
-          </w:p>
-        </w:tc>
-      </w:tr>
-      <w:tr>
-        <w:trPr>
-          <w:tblCellSpacing w:w="15" w:type="dxa"/>
-        </w:trPr>
-        <w:tc>
-          <w:tcPr>
-            <w:tcW w:w="0" w:type="auto"/>
-            <w:vAlign w:val="center"/>
-            <w:hideMark/>
-          </w:tcPr>
-          <w:p>
-            <w:r>
-              <w:t>PF-07</w:t>
-            </w:r>
-          </w:p>
-        </w:tc>
-        <w:tc>
-          <w:tcPr>
-            <w:tcW w:w="0" w:type="auto"/>
-            <w:vAlign w:val="center"/>
-            <w:hideMark/>
-          </w:tcPr>
-          <w:p>
-            <w:r>
-              <w:t>Sistema de pagos y liquidaciones</w:t>
-            </w:r>
-          </w:p>
-        </w:tc>
-        <w:tc>
-          <w:tcPr>
-            <w:tcW w:w="0" w:type="auto"/>
-            <w:vAlign w:val="center"/>
-            <w:hideMark/>
-          </w:tcPr>
-          <w:p>
-            <w:r>
-              <w:t>Alta</w:t>
-            </w:r>
-          </w:p>
-        </w:tc>
-        <w:tc>
-          <w:tcPr>
-            <w:tcW w:w="0" w:type="auto"/>
-            <w:vAlign w:val="center"/>
-            <w:hideMark/>
-          </w:tcPr>
-          <w:p>
-            <w:r>
-              <w:t>Financiera</w:t>
-            </w:r>
-          </w:p>
-        </w:tc>
-      </w:tr>
-      <w:tr>
-        <w:trPr>
-          <w:tblCellSpacing w:w="15" w:type="dxa"/>
-        </w:trPr>
-        <w:tc>
-          <w:tcPr>
-            <w:tcW w:w="0" w:type="auto"/>
-            <w:vAlign w:val="center"/>
-            <w:hideMark/>
-          </w:tcPr>
-          <w:p>
-            <w:r>
-              <w:lastRenderedPageBreak/>
-              <w:t>PF-08</w:t>
-            </w:r>
-          </w:p>
-        </w:tc>
-        <w:tc>
-          <w:tcPr>
-            <w:tcW w:w="0" w:type="auto"/>
-            <w:vAlign w:val="center"/>
-            <w:hideMark/>
-          </w:tcPr>
-          <w:p>
-            <w:r>
-              <w:t>Reportes de sesiones e ingresos</w:t>
-            </w:r>
-          </w:p>
-        </w:tc>
-        <w:tc>
-          <w:tcPr>
-            <w:tcW w:w="0" w:type="auto"/>
-            <w:vAlign w:val="center"/>
-            <w:hideMark/>
-          </w:tcPr>
-          <w:p>
-            <w:r>
-              <w:t>Media</w:t>
-            </w:r>
-          </w:p>
-        </w:tc>
-        <w:tc>
-          <w:tcPr>
-            <w:tcW w:w="0" w:type="auto"/>
-            <w:vAlign w:val="center"/>
-            <w:hideMark/>
-          </w:tcPr>
-          <w:p>
-            <w:r>
-              <w:t>Analítica</w:t>
-            </w:r>
-          </w:p>
-        </w:tc>
-      </w:tr>
-      <w:tr>
-        <w:trPr>
-          <w:tblCellSpacing w:w="15" w:type="dxa"/>
-        </w:trPr>
-        <w:tc>
-          <w:tcPr>
-            <w:tcW w:w="0" w:type="auto"/>
-            <w:vAlign w:val="center"/>
-            <w:hideMark/>
-          </w:tcPr>
-          <w:p>
-            <w:r>
-              <w:t>PF-09</w:t>
-            </w:r>
-          </w:p>
-        </w:tc>
-        <w:tc>
-          <w:tcPr>
-            <w:tcW w:w="0" w:type="auto"/>
-            <w:vAlign w:val="center"/>
-            <w:hideMark/>
-          </w:tcPr>
-          <w:p>
-            <w:r>
-              <w:t>Panel de control profesional</w:t>
-            </w:r>
-          </w:p>
-        </w:tc>
-        <w:tc>
-          <w:tcPr>
-            <w:tcW w:w="0" w:type="auto"/>
-            <w:vAlign w:val="center"/>
-            <w:hideMark/>
-          </w:tcPr>
-          <w:p>
-            <w:r>
-              <w:t>Media</w:t>
-            </w:r>
-          </w:p>
-        </w:tc>
-        <w:tc>
-          <w:tcPr>
-            <w:tcW w:w="0" w:type="auto"/>
-            <w:vAlign w:val="center"/>
-            <w:hideMark/>
-          </w:tcPr>
-          <w:p>
-            <w:r>
-              <w:t>Visual</w:t>
-            </w:r>
-          </w:p>
-        </w:tc>
-      </w:tr>
-      <w:tr>
-        <w:trPr>
-          <w:tblCellSpacing w:w="15" w:type="dxa"/>
-        </w:trPr>
-        <w:tc>
-          <w:tcPr>
-            <w:tcW w:w="0" w:type="auto"/>
-            <w:vAlign w:val="center"/>
-            <w:hideMark/>
-          </w:tcPr>
-          <w:p>
-            <w:r>
-              <w:t>PF-10</w:t>
-            </w:r>
-          </w:p>
-        </w:tc>
-        <w:tc>
-          <w:tcPr>
-            <w:tcW w:w="0" w:type="auto"/>
-            <w:vAlign w:val="center"/>
-            <w:hideMark/>
-          </w:tcPr>
-          <w:p>
-            <w:r>
-              <w:t>Seguridad y expiración de sesión</w:t>
-            </w:r>
-          </w:p>
-        </w:tc>
-        <w:tc>
-          <w:tcPr>
-            <w:tcW w:w="0" w:type="auto"/>
-            <w:vAlign w:val="center"/>
-            <w:hideMark/>
-          </w:tcPr>
-          <w:p>
-            <w:r>
-              <w:t>Media</w:t>
-            </w:r>
-          </w:p>
-        </w:tc>
-        <w:tc>
-          <w:tcPr>
-            <w:tcW w:w="0" w:type="auto"/>
-            <w:vAlign w:val="center"/>
-            <w:hideMark/>
-          </w:tcPr>
-          <w:p>
-            <w:r>
-              <w:t>Seguridad</w:t>
-            </w:r>
-          </w:p>
-        </w:tc>
-      </w:tr>
-    </w:tbl>
-    <w:p>
-      <w:r>
-        <w:pict w14:anchorId="59B740D7">
-          <v:rect id="_x0000_i1030" style="width:0;height:1.5pt" o:hralign="center" o:hrstd="t" o:hr="t" fillcolor="#a0a0a0" stroked="f"/>
-        </w:pict>
-      </w:r>
-    </w:p>
-    <w:p>
-      <w:pPr>
-        <w:rPr>
-          <w:b/>
-          <w:bCs/>
-        </w:rPr>
-      </w:pPr>
-      <w:r>
-        <w:rPr>
-          <w:b/>
-          <w:bCs/>
-        </w:rPr>
-        <w:t>9. Planificación por Sprints (Scrum – 10 Sprints)</w:t>
-      </w:r>
-    </w:p>
-    <w:p>
-      <w:pPr>
-        <w:rPr>
-          <w:b/>
-          <w:bCs/>
-        </w:rPr>
-      </w:pPr>
-      <w:r>
-        <w:rPr>
-          <w:b/>
-          <w:bCs/>
-        </w:rPr>
-        <w:t>Sprint 1 – Estructura del Proyecto y Base de Datos</w:t>
-      </w:r>
-    </w:p>
-    <w:p>
-      <w:pPr>
-        <w:numPr>
-          <w:ilvl w:val="0"/>
-          <w:numId w:val="10"/>
-        </w:numPr>
-      </w:pPr>
-      <w:r>
-        <w:t>Reutilizar la arquitectura MVC base.</w:t>
-      </w:r>
-    </w:p>
-    <w:p>
-      <w:pPr>
-        <w:numPr>
-          <w:ilvl w:val="0"/>
-          <w:numId w:val="10"/>
-        </w:numPr>
-      </w:pPr>
-      <w:r>
-        <w:t>Crear entidades: Profesional, Documento, Sala, Sesion, Pago.</w:t>
-      </w:r>
-    </w:p>
-    <w:p>
-      <w:pPr>
-        <w:numPr>
-          <w:ilvl w:val="0"/>
-          <w:numId w:val="10"/>
-        </w:numPr>
-      </w:pPr>
-      <w:r>
-        <w:t>Migraciones iniciales.</w:t>
-      </w:r>
-    </w:p>
-    <w:p>
-      <w:pPr>
-        <w:numPr>
-          <w:ilvl w:val="0"/>
-          <w:numId w:val="10"/>
-        </w:numPr>
-      </w:pPr>
-      <w:r>
-        <w:t>Entregable: estructura técnica lista.</w:t>
-      </w:r>
-    </w:p>
-    <w:p>
-      <w:pPr>
-        <w:numPr>
-          <w:ilvl w:val="0"/>
-          <w:numId w:val="10"/>
-        </w:numPr>
-      </w:pPr>
-      <w:r>
-        <w:t>Criterio: conexión establecida y tablas creadas.</w:t>
-      </w:r>
-    </w:p>
-    <w:p>
-      <w:r>
-        <w:pict w14:anchorId="663F705D">
-          <v:rect id="_x0000_i1031" style="width:0;height:1.5pt" o:hralign="center" o:hrstd="t" o:hr="t" fillcolor="#a0a0a0" stroked="f"/>
-        </w:pict>
-      </w:r>
-    </w:p>
-    <w:p>
-      <w:pPr>
-        <w:rPr>
-          <w:b/>
-          <w:bCs/>
-        </w:rPr>
-      </w:pPr>
-      <w:r>
-        <w:rPr>
-          <w:b/>
-          <w:bCs/>
-        </w:rPr>
-        <w:t>Sprint 2 – Registro Profesional</w:t>
-      </w:r>
-    </w:p>
-    <w:p>
-      <w:pPr>
-        <w:numPr>
-          <w:ilvl w:val="0"/>
-          <w:numId w:val="11"/>
-        </w:numPr>
-      </w:pPr>
-      <w:r>
-        <w:t>Crear AuthController con vista RegistroProfesional.</w:t>
-      </w:r>
-    </w:p>
-    <w:p>
-      <w:pPr>
-        <w:numPr>
-          <w:ilvl w:val="0"/>
-          <w:numId w:val="11"/>
-        </w:numPr>
-      </w:pPr>
-      <w:r>
-        <w:t>Captura de datos básicos.</w:t>
-      </w:r>
-    </w:p>
-    <w:p>
-      <w:pPr>
-        <w:numPr>
-          <w:ilvl w:val="0"/>
-          <w:numId w:val="11"/>
-        </w:numPr>
-      </w:pPr>
-      <w:r>
-        <w:t>Entregable: formulario funcional.</w:t>
-      </w:r>
-    </w:p>
-    <w:p>
-      <w:pPr>
-        <w:numPr>
-          <w:ilvl w:val="0"/>
-          <w:numId w:val="11"/>
-        </w:numPr>
-      </w:pPr>
-      <w:r>
-        <w:t>Criterio: inserción correcta en base de datos.</w:t>
-      </w:r>
-    </w:p>
-    <w:p>
-      <w:r>
-        <w:pict w14:anchorId="2AC68E15">
-          <v:rect id="_x0000_i1032" style="width:0;height:1.5pt" o:hralign="center" o:hrstd="t" o:hr="t" fillcolor="#a0a0a0" stroked="f"/>
-        </w:pict>
-      </w:r>
-    </w:p>
-    <w:p>
-      <w:pPr>
-        <w:rPr>
-          <w:b/>
-          <w:bCs/>
-        </w:rPr>
-      </w:pPr>
-      <w:r>
-        <w:rPr>
-          <w:b/>
-          <w:bCs/>
-        </w:rPr>
-        <w:t>Sprint 3 – Carga de Documentos</w:t>
-      </w:r>
-    </w:p>
-    <w:p>
-      <w:pPr>
-        <w:numPr>
-          <w:ilvl w:val="0"/>
-          <w:numId w:val="12"/>
-        </w:numPr>
-      </w:pPr>
-      <w:r>
-        <w:t>Implementar vista DocumentosProfesional.</w:t>
-      </w:r>
-    </w:p>
-    <w:p>
-      <w:pPr>
-        <w:numPr>
-          <w:ilvl w:val="0"/>
-          <w:numId w:val="12"/>
-        </w:numPr>
-      </w:pPr>
-      <w:r>
-        <w:t>Subida de archivos (PDF/JPG).</w:t>
-      </w:r>
-    </w:p>
-    <w:p>
-      <w:pPr>
-        <w:numPr>
-          <w:ilvl w:val="0"/>
-          <w:numId w:val="12"/>
-        </w:numPr>
-      </w:pPr>
-      <w:r>
-        <w:t>Validación de tipo y tamaño.</w:t>
-      </w:r>
-    </w:p>
-    <w:p>
-      <w:pPr>
-        <w:numPr>
-          <w:ilvl w:val="0"/>
-          <w:numId w:val="12"/>
-        </w:numPr>
-      </w:pPr>
-      <w:r>
-        <w:t>Entregable: almacenamiento de documentos en servidor.</w:t>
-      </w:r>
-    </w:p>
-    <w:p>
-      <w:pPr>
-        <w:numPr>
-          <w:ilvl w:val="0"/>
-          <w:numId w:val="12"/>
-        </w:numPr>
-      </w:pPr>
-      <w:r>
-        <w:t>Criterio: archivos guardados y asociados al profesional.</w:t>
-      </w:r>
-    </w:p>
-    <w:p>
-      <w:r>
-        <w:lastRenderedPageBreak/>
-        <w:pict w14:anchorId="1E457D7E">
-          <v:rect id="_x0000_i1033" style="width:0;height:1.5pt" o:hralign="center" o:hrstd="t" o:hr="t" fillcolor="#a0a0a0" stroked="f"/>
-        </w:pict>
-      </w:r>
-    </w:p>
-    <w:p>
-      <w:pPr>
-        <w:rPr>
-          <w:b/>
-          <w:bCs/>
-        </w:rPr>
-      </w:pPr>
-      <w:r>
-        <w:rPr>
-          <w:b/>
-          <w:bCs/>
-        </w:rPr>
-        <w:t>Sprint 4 – Validación Administrativa</w:t>
-      </w:r>
-    </w:p>
-    <w:p>
-      <w:pPr>
-        <w:numPr>
-          <w:ilvl w:val="0"/>
-          <w:numId w:val="13"/>
-        </w:numPr>
-      </w:pPr>
-      <w:r>
-        <w:t>Crear AdministradorController para revisar documentos.</w:t>
-      </w:r>
-    </w:p>
-    <w:p>
-      <w:pPr>
-        <w:numPr>
-          <w:ilvl w:val="0"/>
-          <w:numId w:val="13"/>
-        </w:numPr>
-      </w:pPr>
-      <w:r>
-        <w:t>Estado de cuenta: Pendiente / Aprobado / Rechazado.</w:t>
-      </w:r>
-    </w:p>
-    <w:p>
-      <w:pPr>
-        <w:numPr>
-          <w:ilvl w:val="0"/>
-          <w:numId w:val="13"/>
-        </w:numPr>
-      </w:pPr>
-      <w:r>
-        <w:t>Entregable: flujo de validación manual completo.</w:t>
-      </w:r>
-    </w:p>
-    <w:p>
-      <w:pPr>
-        <w:numPr>
-          <w:ilvl w:val="0"/>
-          <w:numId w:val="13"/>
-        </w:numPr>
-      </w:pPr>
-      <w:r>
-        <w:t>Criterio: solo aprobados acceden al panel profesional.</w:t>
-      </w:r>
-    </w:p>
-    <w:p>
-      <w:r>
-        <w:pict w14:anchorId="6AEC17A6">
-          <v:rect id="_x0000_i1034" style="width:0;height:1.5pt" o:hralign="center" o:hrstd="t" o:hr="t" fillcolor="#a0a0a0" stroked="f"/>
-        </w:pict>
-      </w:r>
-    </w:p>
-    <w:p>
-      <w:pPr>
-        <w:rPr>
-          <w:b/>
-          <w:bCs/>
-        </w:rPr>
-      </w:pPr>
-      <w:r>
-        <w:rPr>
-          <w:b/>
-          <w:bCs/>
-        </w:rPr>
-        <w:t>Sprint 5 – Panel Profesional</w:t>
-      </w:r>
-    </w:p>
-    <w:p>
-      <w:pPr>
-        <w:numPr>
-          <w:ilvl w:val="0"/>
-          <w:numId w:val="14"/>
-        </w:numPr>
-      </w:pPr>
-      <w:r>
-        <w:t>Crear PerfilProfesionalController y Dashboard.</w:t>
-      </w:r>
-    </w:p>
-    <w:p>
-      <w:pPr>
-        <w:numPr>
-          <w:ilvl w:val="0"/>
-          <w:numId w:val="14"/>
-        </w:numPr>
-      </w:pPr>
-      <w:r>
-        <w:t>Mostrar resumen de salas, usuarios, ingresos.</w:t>
-      </w:r>
-    </w:p>
-    <w:p>
-      <w:pPr>
-        <w:numPr>
-          <w:ilvl w:val="0"/>
-          <w:numId w:val="14"/>
-        </w:numPr>
-      </w:pPr>
-      <w:r>
-        <w:t>Entregable: panel con datos reales.</w:t>
-      </w:r>
-    </w:p>
-    <w:p>
-      <w:pPr>
-        <w:numPr>
-          <w:ilvl w:val="0"/>
-          <w:numId w:val="14"/>
-        </w:numPr>
-      </w:pPr>
-      <w:r>
-        <w:t>Criterio: datos cargados desde BD.</w:t>
-      </w:r>
-    </w:p>
-    <w:p>
-      <w:r>
-        <w:pict w14:anchorId="7E542314">
-          <v:rect id="_x0000_i1035" style="width:0;height:1.5pt" o:hralign="center" o:hrstd="t" o:hr="t" fillcolor="#a0a0a0" stroked="f"/>
-        </w:pict>
-      </w:r>
-    </w:p>
-    <w:p>
-      <w:pPr>
-        <w:rPr>
-          <w:b/>
-          <w:bCs/>
-        </w:rPr>
-      </w:pPr>
-      <w:r>
-        <w:rPr>
-          <w:b/>
-          <w:bCs/>
-        </w:rPr>
-        <w:t>Sprint 6 – Creación y Gestión de Salas</w:t>
-      </w:r>
-    </w:p>
-    <w:p>
-      <w:pPr>
-        <w:numPr>
-          <w:ilvl w:val="0"/>
-          <w:numId w:val="15"/>
-        </w:numPr>
-      </w:pPr>
-      <w:r>
-        <w:t>Formularios para crear, editar y eliminar salas.</w:t>
-      </w:r>
-    </w:p>
-    <w:p>
-      <w:pPr>
-        <w:numPr>
-          <w:ilvl w:val="0"/>
-          <w:numId w:val="15"/>
-        </w:numPr>
-      </w:pPr>
-      <w:r>
-        <w:t>Definir tipo de sala (paga/libre) y cupos máximos.</w:t>
-      </w:r>
-    </w:p>
-    <w:p>
-      <w:pPr>
-        <w:numPr>
-          <w:ilvl w:val="0"/>
-          <w:numId w:val="15"/>
-        </w:numPr>
-      </w:pPr>
-      <w:r>
-        <w:t>Entregable: CRUD funcional.</w:t>
-      </w:r>
-    </w:p>
-    <w:p>
-      <w:pPr>
-        <w:numPr>
-          <w:ilvl w:val="0"/>
-          <w:numId w:val="15"/>
-        </w:numPr>
-      </w:pPr>
-      <w:r>
-        <w:t>Criterio: salas visibles para usuarios tras publicación.</w:t>
-      </w:r>
-    </w:p>
-    <w:p>
-      <w:r>
-        <w:pict w14:anchorId="7CD2A621">
-          <v:rect id="_x0000_i1036" style="width:0;height:1.5pt" o:hralign="center" o:hrstd="t" o:hr="t" fillcolor="#a0a0a0" stroked="f"/>
-        </w:pict>
-      </w:r>
-    </w:p>
-    <w:p>
-      <w:pPr>
-        <w:rPr>
-          <w:b/>
-          <w:bCs/>
-        </w:rPr>
-      </w:pPr>
-      <w:r>
-        <w:rPr>
-          <w:b/>
-          <w:bCs/>
-        </w:rPr>
-        <w:t>Sprint 7 – Gestión de Usuarios en Sala</w:t>
-      </w:r>
-    </w:p>
-    <w:p>
-      <w:pPr>
-        <w:numPr>
-          <w:ilvl w:val="0"/>
-          <w:numId w:val="16"/>
-        </w:numPr>
-      </w:pPr>
-      <w:r>
-        <w:t>Mostrar listado de usuarios inscritos.</w:t>
-      </w:r>
-    </w:p>
-    <w:p>
-      <w:pPr>
-        <w:numPr>
-          <w:ilvl w:val="0"/>
-          <w:numId w:val="16"/>
-        </w:numPr>
-      </w:pPr>
-      <w:r>
-        <w:t>Acciones de control (aceptar, bloquear, expulsar).</w:t>
-      </w:r>
-    </w:p>
-    <w:p>
-      <w:pPr>
-        <w:numPr>
-          <w:ilvl w:val="0"/>
-          <w:numId w:val="16"/>
-        </w:numPr>
-      </w:pPr>
-      <w:r>
-        <w:t>Entregable: control dinámico de acceso.</w:t>
-      </w:r>
-    </w:p>
-    <w:p>
-      <w:pPr>
-        <w:numPr>
-          <w:ilvl w:val="0"/>
-          <w:numId w:val="16"/>
-        </w:numPr>
-      </w:pPr>
-      <w:r>
-        <w:t>Criterio: cupo máximo respetado.</w:t>
-      </w:r>
-    </w:p>
-    <w:p>
-      <w:r>
-        <w:pict w14:anchorId="383C4789">
-          <v:rect id="_x0000_i1037" style="width:0;height:1.5pt" o:hralign="center" o:hrstd="t" o:hr="t" fillcolor="#a0a0a0" stroked="f"/>
-        </w:pict>
-      </w:r>
-    </w:p>
-    <w:p>
-      <w:pPr>
-        <w:rPr>
-          <w:b/>
-          <w:bCs/>
-        </w:rPr>
-      </w:pPr>
-      <w:r>
-        <w:rPr>
-          <w:b/>
-          <w:bCs/>
-        </w:rPr>
-        <w:t>Sprint 8 – Módulo de Pagos y Liquidaciones</w:t>
-      </w:r>
-    </w:p>
-    <w:p>
-      <w:pPr>
-        <w:numPr>
-          <w:ilvl w:val="0"/>
-          <w:numId w:val="17"/>
-        </w:numPr>
-      </w:pPr>
-      <w:r>
-        <w:lastRenderedPageBreak/>
-        <w:t>Implementar lógica de pagos recibidos.</w:t>
-      </w:r>
-    </w:p>
-    <w:p>
-      <w:pPr>
-        <w:numPr>
-          <w:ilvl w:val="0"/>
-          <w:numId w:val="17"/>
-        </w:numPr>
-      </w:pPr>
-      <w:r>
-        <w:t>Mostrar reportes de ingresos.</w:t>
-      </w:r>
-    </w:p>
-    <w:p>
-      <w:pPr>
-        <w:numPr>
-          <w:ilvl w:val="0"/>
-          <w:numId w:val="17"/>
-        </w:numPr>
-      </w:pPr>
-      <w:r>
-        <w:t>Entregable: integración con pasarela de pago (PayU/MercadoPago).</w:t>
-      </w:r>
-    </w:p>
-    <w:p>
-      <w:pPr>
-        <w:numPr>
-          <w:ilvl w:val="0"/>
-          <w:numId w:val="17"/>
-        </w:numPr>
-      </w:pPr>
-      <w:r>
-        <w:t>Criterio: pagos visibles y correctos en panel profesional.</w:t>
-      </w:r>
-    </w:p>
-    <w:p>
-      <w:r>
-        <w:pict w14:anchorId="7B911CDF">
-          <v:rect id="_x0000_i1038" style="width:0;height:1.5pt" o:hralign="center" o:hrstd="t" o:hr="t" fillcolor="#a0a0a0" stroked="f"/>
-        </w:pict>
-      </w:r>
-    </w:p>
-    <w:p>
-      <w:pPr>
-        <w:rPr>
-          <w:b/>
-          <w:bCs/>
-        </w:rPr>
-      </w:pPr>
-      <w:r>
-        <w:rPr>
-          <w:b/>
-          <w:bCs/>
-        </w:rPr>
-        <w:t>Sprint 9 – Reportes e Historial</w:t>
-      </w:r>
-    </w:p>
-    <w:p>
-      <w:pPr>
-        <w:pStyle w:val="Prrafodelista"/>
-        <w:numPr>
-          <w:ilvl w:val="0"/>
-          <w:numId w:val="18"/>
-        </w:numPr>
-      </w:pPr>
-      <w:r>
-        <w:t>Filtros por fecha, usuario o sala.</w:t>
-      </w:r>
-    </w:p>
-    <w:p>
-      <w:pPr>
-        <w:pStyle w:val="Prrafodelista"/>
-        <w:numPr>
-          <w:ilvl w:val="0"/>
-          <w:numId w:val="18"/>
-        </w:numPr>
-      </w:pPr>
-      <w:r>
-        <w:t>Historial de citas por usuario</w:t>
-      </w:r>
-    </w:p>
-    <w:p>
-      <w:pPr>
-        <w:numPr>
-          <w:ilvl w:val="0"/>
-          <w:numId w:val="18"/>
-        </w:numPr>
-      </w:pPr>
-      <w:r>
-        <w:t>Entregable: reportes funcionales.</w:t>
-      </w:r>
-    </w:p>
-    <w:p>
-      <w:pPr>
-        <w:numPr>
-          <w:ilvl w:val="0"/>
-          <w:numId w:val="18"/>
-        </w:numPr>
-      </w:pPr>
-    </w:p>
-    <w:p>
-      <w:r>
-        <w:pict w14:anchorId="090D8981">
-          <v:rect id="_x0000_i1039" style="width:0;height:1.5pt" o:hralign="center" o:hrstd="t" o:hr="t" fillcolor="#a0a0a0" stroked="f"/>
-        </w:pict>
-      </w:r>
-    </w:p>
-    <w:p>
-      <w:pPr>
-        <w:rPr>
-          <w:b/>
-          <w:bCs/>
-        </w:rPr>
-      </w:pPr>
-      <w:r>
-        <w:rPr>
-          <w:b/>
-          <w:bCs/>
-        </w:rPr>
-        <w:t>Sprint 10 – Seguridad y Cierre Automático</w:t>
-      </w:r>
-    </w:p>
-    <w:p>
-      <w:pPr>
-        <w:numPr>
-          <w:ilvl w:val="0"/>
-          <w:numId w:val="19"/>
-        </w:numPr>
-      </w:pPr>
-      <w:r>
-        <w:t>Middleware de expiración automática.</w:t>
-      </w:r>
-    </w:p>
-    <w:p>
-      <w:pPr>
-        <w:numPr>
-          <w:ilvl w:val="0"/>
-          <w:numId w:val="19"/>
-        </w:numPr>
-      </w:pPr>
-      <w:r>
-        <w:t>Logs de acceso profesional.</w:t>
-      </w:r>
-    </w:p>
-    <w:p>
-      <w:pPr>
-        <w:numPr>
-          <w:ilvl w:val="0"/>
-          <w:numId w:val="19"/>
-        </w:numPr>
-      </w:pPr>
-      <w:r>
-        <w:t>Entregable: seguridad final implementada.</w:t>
-      </w:r>
-    </w:p>
-    <w:p>
-      <w:pPr>
-        <w:numPr>
-          <w:ilvl w:val="0"/>
-          <w:numId w:val="19"/>
-        </w:numPr>
-      </w:pPr>
-      <w:r>
-        <w:t>Criterio: logout automático y auditoría registrada.</w:t>
-      </w:r>
-    </w:p>
-    <w:p>
-      <w:r>
-        <w:pict w14:anchorId="6760E251">
-          <v:rect id="_x0000_i1040" style="width:0;height:1.5pt" o:hralign="center" o:hrstd="t" o:hr="t" fillcolor="#a0a0a0" stroked="f"/>
-        </w:pict>
-      </w:r>
-    </w:p>
-    <w:p>
-      <w:pPr>
-        <w:rPr>
-          <w:b/>
-          <w:bCs/>
-        </w:rPr>
-      </w:pPr>
-      <w:r>
-        <w:rPr>
-          <w:b/>
-          <w:bCs/>
-        </w:rPr>
-        <w:t>10. Consideraciones Finales</w:t>
-      </w:r>
-    </w:p>
-    <w:p>
-      <w:pPr>
-        <w:numPr>
-          <w:ilvl w:val="0"/>
-          <w:numId w:val="20"/>
-        </w:numPr>
-      </w:pPr>
-      <w:r>
-        <w:t>Los documentos cargados por los profesionales serán validados manualmente antes de permitir acceso total.</w:t>
-      </w:r>
-    </w:p>
-    <w:p>
-      <w:pPr>
-        <w:numPr>
-          <w:ilvl w:val="0"/>
-          <w:numId w:val="20"/>
-        </w:numPr>
-      </w:pPr>
-      <w:r>
-        <w:t>Las salas tendrán un número máximo de usuarios configurable (por ejemplo, 50).</w:t>
-      </w:r>
-    </w:p>
-    <w:p>
-      <w:pPr>
-        <w:numPr>
-          <w:ilvl w:val="0"/>
-          <w:numId w:val="20"/>
-        </w:numPr>
-      </w:pPr>
-      <w:r>
-        <w:t>Los pagos a profesionales estarán sujetos a políticas de comisión.</w:t>
-      </w:r>
-    </w:p>
-    <w:p>
-      <w:pPr>
-        <w:numPr>
-          <w:ilvl w:val="0"/>
-          <w:numId w:val="20"/>
-        </w:numPr>
-      </w:pPr>
-      <w:r>
-        <w:t>Toda la comunicación (confirmaciones, validaciones, pagos) se notificará vía correo.</w:t>
-      </w:r>
-    </w:p>
-    <w:p>
-      <w:pPr>
-        <w:numPr>
-          <w:ilvl w:val="0"/>
-          <w:numId w:val="20"/>
-        </w:numPr>
-      </w:pPr>
-      <w:r>
-        <w:t xml:space="preserve">Se recomienda almacenar documentos en </w:t>
-      </w:r>
-      <w:r>
-        <w:t>email del sistema</w:t>
-      </w:r>
-    </w:p>
-    <w:p>
-      <w:pPr>
-        <w:numPr>
-          <w:ilvl w:val="0"/>
-          <w:numId w:val="20"/>
-        </w:numPr>
-      </w:pPr>
-      <w:r>
-        <w:t>Se aplicarán validaciones adicionales del lado cliente y servidor.</w:t>
-      </w:r>
-    </w:p>
-    <w:p>
-      <w:pPr>
-        <w:numPr>
-          <w:ilvl w:val="0"/>
-          <w:numId w:val="20"/>
-        </w:numPr>
-      </w:pPr>
-      <w:r>
-        <w:lastRenderedPageBreak/>
-        <w:t>Se usará Authorize(Roles = "Profesional") para controlar accesos.</w:t>
-      </w:r>
-    </w:p>
-    <w:p>
-      <w:pPr>
-        <w:numPr>
-          <w:ilvl w:val="0"/>
-          <w:numId w:val="20"/>
-        </w:numPr>
-      </w:pPr>
-      <w:r>
-        <w:t>Se implementará paginación y filtros en listados de usuarios y salas.</w:t>
-      </w:r>
-    </w:p>
-    <w:p/>
-    <w:p/>
     <w:p/>
     <w:sectPr>
       <w:pgSz w:w="12240" w:h="15840"/>
@@ -6203,6 +4162,7 @@
   <w:style w:type="character" w:default="1" w:styleId="Fuentedeprrafopredeter">
     <w:name w:val="Default Paragraph Font"/>
     <w:uiPriority w:val="1"/>
+    <w:semiHidden/>
     <w:unhideWhenUsed/>
   </w:style>
   <w:style w:type="table" w:default="1" w:styleId="Tablanormal">

</xml_diff>